<commit_message>
borrado basura y actualizado diagrama de gantt y cambios.txt
</commit_message>
<xml_diff>
--- a/Documentacion y otros/PPROG - To do.docx
+++ b/Documentacion y otros/PPROG - To do.docx
@@ -7,6 +7,19 @@
         <w:ind w:left="360"/>
       </w:pPr>
       <w:r>
+        <w:t>DESACTUALIZADO</w:t>
+      </w:r>
+    </w:p>
+    <w:p>
+      <w:pPr>
+        <w:ind w:left="360"/>
+      </w:pPr>
+    </w:p>
+    <w:p>
+      <w:pPr>
+        <w:ind w:left="360"/>
+      </w:pPr>
+      <w:r>
         <w:t xml:space="preserve">Leyenda: </w:t>
       </w:r>
     </w:p>
@@ -629,6 +642,7 @@
         </w:numPr>
       </w:pPr>
       <w:r>
+        <w:lastRenderedPageBreak/>
         <w:t xml:space="preserve">Funcion </w:t>
       </w:r>
       <w:r>
@@ -674,7 +688,6 @@
         </w:numPr>
       </w:pPr>
       <w:r>
-        <w:lastRenderedPageBreak/>
         <w:t>Game</w:t>
       </w:r>
     </w:p>

</xml_diff>